<commit_message>
09.10.2026 - Car List Nr. in Rent Setup
</commit_message>
<xml_diff>
--- a/.vscode/src/Reports/ClosedRentalInvoicesLayout.docx
+++ b/.vscode/src/Reports/ClosedRentalInvoicesLayout.docx
@@ -3157,6 +3157,63 @@
  < / N a v W o r d R e p o r t X m l P a r t > 
 </file>
 
+<file path=customXml/item2.xml>��< ? x m l   v e r s i o n = " 1 . 0 "   e n c o d i n g = " u t f - 1 6 " ? > + 
+ < N a v W o r d R e p o r t X m l P a r t   x m l n s = " u r n : m i c r o s o f t - d y n a m i c s - b u s i n e s s c e n t r a l / i n t e r n a l / e x t e n d e d / r e p o r t s / C l o s e d _ R e n t a l _ I n v o i c e s _ W o r d / 5 0 1 0 2 / " > + 
+     < T o o l t i p s   / > + 
+     < R e n t a l L i s t C l o s e d   E l e m e n t T y p e = " D a t a I t e m "   E l e m e n t I d = " 1 1 3 9 4 5 1 0 7 " > + 
+         < A d d r e s s   E l e m e n t T y p e = " C o l u m n "   E l e m e n t I d = " 1 0 2 0 9 6 0 6 9 1 "   D a t a T y p e = " T e x t " > A d d r e s s < / A d d r e s s > + 
+         < C a r B r a n d   E l e m e n t T y p e = " C o l u m n "   E l e m e n t I d = " 1 7 6 1 4 1 6 2 2 6 "   D a t a T y p e = " T e x t " > C a r B r a n d < / C a r B r a n d > + 
+         < C a r M o d e l   E l e m e n t T y p e = " C o l u m n "   E l e m e n t I d = " 1 2 1 7 0 7 5 8 9 8 "   D a t a T y p e = " T e x t " > C a r M o d e l < / C a r M o d e l > + 
+         < C i t y   E l e m e n t T y p e = " C o l u m n "   E l e m e n t I d = " 1 4 3 2 6 9 1 7 5 8 "   D a t a T y p e = " T e x t " > C i t y < / C i t y > + 
+         < F i r s t F r o m D a t e   E l e m e n t T y p e = " C o l u m n "   E l e m e n t I d = " 1 6 9 4 0 2 6 2 7 "   D a t a T y p e = " D a t e " > F i r s t F r o m D a t e < / F i r s t F r o m D a t e > + 
+         < F r o m D a t e   E l e m e n t T y p e = " C o l u m n "   E l e m e n t I d = " 1 3 1 0 2 3 6 0 9 7 "   D a t a T y p e = " D a t e " > F r o m D a t e < / F r o m D a t e > + 
+         < L a s t T o D a t e   E l e m e n t T y p e = " C o l u m n "   E l e m e n t I d = " 4 4 0 3 4 0 3 8 4 "   D a t a T y p e = " D a t e " > L a s t T o D a t e < / L a s t T o D a t e > + 
+         < M i l e a g e   E l e m e n t T y p e = " C o l u m n "   E l e m e n t I d = " 1 4 1 0 8 3 5 4 6 1 "   D a t a T y p e = " I n t e g e r " > M i l e a g e < / M i l e a g e > + 
+         < M i l e a g e C o s t   E l e m e n t T y p e = " C o l u m n "   E l e m e n t I d = " 6 6 5 4 6 7 7 2 0 "   D a t a T y p e = " D e c i m a l " > M i l e a g e C o s t < / M i l e a g e C o s t > + 
+         < N o   E l e m e n t T y p e = " C o l u m n "   E l e m e n t I d = " 1 1 9 8 2 6 8 3 4 0 "   D a t a T y p e = " C o d e " > N o < / N o > + 
+         < P o s t C o d e   E l e m e n t T y p e = " C o l u m n "   E l e m e n t I d = " 1 2 2 6 9 1 4 8 0 8 "   D a t a T y p e = " T e x t " > P o s t C o d e < / P o s t C o d e > + 
+         < R e g i s t r a t i o n N o   E l e m e n t T y p e = " C o l u m n "   E l e m e n t I d = " 1 2 9 9 4 5 3 5 0 1 "   D a t a T y p e = " T e x t " > R e g i s t r a t i o n N o < / R e g i s t r a t i o n N o > + 
+         < R e n t a l D a y   E l e m e n t T y p e = " C o l u m n "   E l e m e n t I d = " 1 5 9 7 6 9 4 9 5 9 "   D a t a T y p e = " I n t e g e r " > R e n t a l D a y < / R e n t a l D a y > + 
+         < R e n t a l D a y C o s t   E l e m e n t T y p e = " C o l u m n "   E l e m e n t I d = " 1 8 1 0 6 8 2 4 8 2 "   D a t a T y p e = " D e c i m a l " > R e n t a l D a y C o s t < / R e n t a l D a y C o s t > + 
+         < R e n t e r N a m e   E l e m e n t T y p e = " C o l u m n "   E l e m e n t I d = " 4 5 2 0 5 8 0 8 "   D a t a T y p e = " T e x t " > R e n t e r N a m e < / R e n t e r N a m e > + 
+         < R e n t e r N o   E l e m e n t T y p e = " C o l u m n "   E l e m e n t I d = " 1 2 4 5 8 1 0 8 4 6 "   D a t a T y p e = " C o d e " > R e n t e r N o < / R e n t e r N o > + 
+         < T o D a t e   E l e m e n t T y p e = " C o l u m n "   E l e m e n t I d = " 1 9 9 0 1 1 0 9 4 6 "   D a t a T y p e = " D a t e " > T o D a t e < / T o D a t e > + 
+         < T o t a l C a r I n s u r a n c e C o s t   E l e m e n t T y p e = " C o l u m n "   E l e m e n t I d = " 6 6 2 2 2 7 1 4 "   D a t a T y p e = " D e c i m a l " > T o t a l C a r I n s u r a n c e C o s t < / T o t a l C a r I n s u r a n c e C o s t > + 
+         < T o t a l C o s t   E l e m e n t T y p e = " C o l u m n "   E l e m e n t I d = " 1 5 4 7 1 4 8 7 0 0 "   D a t a T y p e = " D e c i m a l " > T o t a l C o s t < / T o t a l C o s t > + 
+         < T o t a l M i l e a g e C o s t   E l e m e n t T y p e = " C o l u m n "   E l e m e n t I d = " 4 3 7 6 2 0 7 0 6 "   D a t a T y p e = " D e c i m a l " > T o t a l M i l e a g e C o s t < / T o t a l M i l e a g e C o s t > + 
+         < T o t a l R e n t a l C o s t s   E l e m e n t T y p e = " C o l u m n "   E l e m e n t I d = " 7 2 0 1 7 5 3 2 7 "   D a t a T y p e = " D e c i m a l " > T o t a l R e n t a l C o s t s < / T o t a l R e n t a l C o s t s > + 
+         < T o t a l R e n t a l D a y C o s t   E l e m e n t T y p e = " C o l u m n "   E l e m e n t I d = " 1 6 1 9 9 0 8 2 8 0 "   D a t a T y p e = " D e c i m a l " > T o t a l R e n t a l D a y C o s t < / T o t a l R e n t a l D a y C o s t > + 
+     < / R e n t a l L i s t C l o s e d > + 
+ < / N a v W o r d R e p o r t X m l P a r t > 
+</file>
+
 <file path=customXml/itemProps1.xml><?xml version="1.0" encoding="utf-8"?>
 <ds:datastoreItem xmlns:ds="http://schemas.openxmlformats.org/officeDocument/2006/customXml" ds:itemID="{52BCB813-E7F1-49BC-A2AE-7196E6840A24}">
   <ds:schemaRefs>

</xml_diff>

<commit_message>
16.10.2026 - Starting and ending mileages in rental/closed rental list tables
</commit_message>
<xml_diff>
--- a/.vscode/src/Reports/ClosedRentalInvoicesLayout.docx
+++ b/.vscode/src/Reports/ClosedRentalInvoicesLayout.docx
@@ -3104,7 +3104,9 @@
 </a:theme>
 </file>
 
-<file path=customXml/item1.xml>��< ? x m l   v e r s i o n = " 1 . 0 "   e n c o d i n g = " u t f - 1 6 " ? > < N a v W o r d R e p o r t X m l P a r t   x m l n s = " u r n : m i c r o s o f t - d y n a m i c s - n a v / r e p o r t s / C l o s e d _ R e n t a l _ I n v o i c e s _ W o r d / 5 0 1 0 2 / " > +<file path=customXml/item1.xml>��< ? x m l   v e r s i o n = " 1 . 0 "   e n c o d i n g = " u t f - 1 6 " ? > + 
+ < N a v W o r d R e p o r t X m l P a r t   x m l n s = " u r n : m i c r o s o f t - d y n a m i c s - n a v / r e p o r t s / C l o s e d _ R e n t a l _ I n v o i c e s _ W o r d / 5 0 1 0 2 / " >   
      < R e n t a l L i s t C l o s e d >   
@@ -3116,14 +3118,14 @@
  
          < C i t y > C i t y < / C i t y >   
+         < E n d i n g M i l e a g e > E n d i n g M i l e a g e < / E n d i n g M i l e a g e > + 
          < F i r s t F r o m D a t e > F i r s t F r o m D a t e < / F i r s t F r o m D a t e >   
          < F r o m D a t e > F r o m D a t e < / F r o m D a t e >   
          < L a s t T o D a t e > L a s t T o D a t e < / L a s t T o D a t e >   
-         < M i l e a g e > M i l e a g e < / M i l e a g e > - 
          < M i l e a g e C o s t > M i l e a g e C o s t < / M i l e a g e C o s t >   
          < N o > N o < / N o > @@ -3139,6 +3141,8 @@
          < R e n t e r N a m e > R e n t e r N a m e < / R e n t e r N a m e >   
          < R e n t e r N o > R e n t e r N o < / R e n t e r N o > + 
+         < S t a r t i n g M i l e a g e > S t a r t i n g M i l e a g e < / S t a r t i n g M i l e a g e >   
          < T o D a t e > T o D a t e < / T o D a t e >   
@@ -3173,14 +3177,14 @@
  
          < C i t y   E l e m e n t T y p e = " C o l u m n "   E l e m e n t I d = " 1 4 3 2 6 9 1 7 5 8 "   D a t a T y p e = " T e x t " > C i t y < / C i t y >   
+         < E n d i n g M i l e a g e   E l e m e n t T y p e = " C o l u m n "   E l e m e n t I d = " 1 7 9 4 8 0 7 8 2 0 "   D a t a T y p e = " I n t e g e r " > E n d i n g M i l e a g e < / E n d i n g M i l e a g e > + 
          < F i r s t F r o m D a t e   E l e m e n t T y p e = " C o l u m n "   E l e m e n t I d = " 1 6 9 4 0 2 6 2 7 "   D a t a T y p e = " D a t e " > F i r s t F r o m D a t e < / F i r s t F r o m D a t e >   
          < F r o m D a t e   E l e m e n t T y p e = " C o l u m n "   E l e m e n t I d = " 1 3 1 0 2 3 6 0 9 7 "   D a t a T y p e = " D a t e " > F r o m D a t e < / F r o m D a t e >   
          < L a s t T o D a t e   E l e m e n t T y p e = " C o l u m n "   E l e m e n t I d = " 4 4 0 3 4 0 3 8 4 "   D a t a T y p e = " D a t e " > L a s t T o D a t e < / L a s t T o D a t e >   
-         < M i l e a g e   E l e m e n t T y p e = " C o l u m n "   E l e m e n t I d = " 1 4 1 0 8 3 5 4 6 1 "   D a t a T y p e = " I n t e g e r " > M i l e a g e < / M i l e a g e > - 
          < M i l e a g e C o s t   E l e m e n t T y p e = " C o l u m n "   E l e m e n t I d = " 6 6 5 4 6 7 7 2 0 "   D a t a T y p e = " D e c i m a l " > M i l e a g e C o s t < / M i l e a g e C o s t >   
          < N o   E l e m e n t T y p e = " C o l u m n "   E l e m e n t I d = " 1 1 9 8 2 6 8 3 4 0 "   D a t a T y p e = " C o d e " > N o < / N o > @@ -3196,6 +3200,8 @@
          < R e n t e r N a m e   E l e m e n t T y p e = " C o l u m n "   E l e m e n t I d = " 4 5 2 0 5 8 0 8 "   D a t a T y p e = " T e x t " > R e n t e r N a m e < / R e n t e r N a m e >   
          < R e n t e r N o   E l e m e n t T y p e = " C o l u m n "   E l e m e n t I d = " 1 2 4 5 8 1 0 8 4 6 "   D a t a T y p e = " C o d e " > R e n t e r N o < / R e n t e r N o > + 
+         < S t a r t i n g M i l e a g e   E l e m e n t T y p e = " C o l u m n "   E l e m e n t I d = " 3 6 6 9 1 1 6 2 1 "   D a t a T y p e = " I n t e g e r " > S t a r t i n g M i l e a g e < / S t a r t i n g M i l e a g e >   
          < T o D a t e   E l e m e n t T y p e = " C o l u m n "   E l e m e n t I d = " 1 9 9 0 1 1 0 9 4 6 "   D a t a T y p e = " D a t e " > T o D a t e < / T o D a t e >   

</xml_diff>